<commit_message>
Documenta los escenarios del enunciado y las dos correcciones
README, dos secciones nuevas en el §12: las pruebas con la CPU saturada y los
ocho escenarios del §11 con el resultado de sus quince corridas. El §3 aclara
que el rechazo unreachable no puede ocurrir con la configuracion de entrega,
porque el grafo del mapa real es fuertemente conexo, y que para ejercitarlo
hace falta un grafo con nodos aislados.

La lista de defectos del §12 suma el quinto, con una distincion que vale la
pena: los cuatro primeros los encontro el validador, y este no pudo. El log
era internamente consistente, los contadores cuadraban, y lo unico mal era la
razon de un rechazo. Un validador compara el log contra las reglas del log;
que el programa diga la verdad sobre el mundo hay que probarlo contra el
mundo, construyendo el escenario.

El informe en docs/ suma la seccion de escenarios, la quinta fila de la tabla
de defectos y esa conclusion.
</commit_message>
<xml_diff>
--- a/docs/Informe_Tecnico_Equipetrol_Delivery.docx
+++ b/docs/Informe_Tecnico_Equipetrol_Delivery.docx
@@ -8762,6 +8762,828 @@
     </w:p>
     <w:p>
       <w:pPr>
+        <w:pStyle w:val="Heading2"/>
+        <w:spacing w:after="120" w:before="260"/>
+      </w:pPr>
+      <w:r>
+        <w:rPr>
+          <w:rFonts w:ascii="Cambria" w:cs="Cambria" w:eastAsia="Cambria" w:hAnsi="Cambria"/>
+          <w:b/>
+          <w:bCs/>
+          <w:color w:val="000000"/>
+          <w:sz w:val="23"/>
+          <w:szCs w:val="23"/>
+        </w:rPr>
+        <w:t xml:space="preserve">8.5 Los escenarios con los que el enunciado dice que se va a probar</w:t>
+      </w:r>
+    </w:p>
+    <w:p>
+      <w:pPr>
+        <w:spacing w:after="140" w:line="300"/>
+      </w:pPr>
+      <w:r>
+        <w:rPr>
+          <w:rFonts w:ascii="Cambria" w:cs="Cambria" w:eastAsia="Cambria" w:hAnsi="Cambria"/>
+          <w:sz w:val="22"/>
+          <w:szCs w:val="22"/>
+        </w:rPr>
+        <w:t xml:space="preserve">El enunciado enumera las configuraciones que van a usar los revisores. Estan todas en config/tests/, y se corrieron tres veces cada una, porque el mismo enunciado avisa que los defectos que aparecen solo a veces son defectos.</w:t>
+      </w:r>
+    </w:p>
+    <w:tbl>
+      <w:tblPr>
+        <w:tblW w:type="dxa" w:w="9026"/>
+        <w:tblBorders>
+          <w:top w:val="single" w:color="000000" w:sz="4"/>
+          <w:left w:val="single" w:color="000000" w:sz="4"/>
+          <w:bottom w:val="single" w:color="000000" w:sz="4"/>
+          <w:right w:val="single" w:color="000000" w:sz="4"/>
+          <w:insideH w:val="single" w:color="auto" w:sz="4"/>
+          <w:insideV w:val="single" w:color="auto" w:sz="4"/>
+        </w:tblBorders>
+      </w:tblPr>
+      <w:tblGrid>
+        <w:gridCol w:w="2708"/>
+        <w:gridCol w:w="3069"/>
+        <w:gridCol w:w="3249"/>
+      </w:tblGrid>
+      <w:tr>
+        <w:trPr>
+          <w:tblHeader/>
+        </w:trPr>
+        <w:tc>
+          <w:tcPr>
+            <w:tcW w:type="dxa" w:w="2708"/>
+            <w:tcMar>
+              <w:top w:type="dxa" w:w="70"/>
+              <w:left w:type="dxa" w:w="110"/>
+              <w:bottom w:type="dxa" w:w="70"/>
+              <w:right w:type="dxa" w:w="110"/>
+            </w:tcMar>
+          </w:tcPr>
+          <w:p>
+            <w:pPr>
+              <w:spacing w:after="0" w:line="260"/>
+            </w:pPr>
+            <w:r>
+              <w:rPr>
+                <w:rFonts w:ascii="Cambria" w:cs="Cambria" w:eastAsia="Cambria" w:hAnsi="Cambria"/>
+                <w:b/>
+                <w:bCs/>
+                <w:sz w:val="20"/>
+                <w:szCs w:val="20"/>
+              </w:rPr>
+              <w:t xml:space="preserve">Escenario</w:t>
+            </w:r>
+          </w:p>
+        </w:tc>
+        <w:tc>
+          <w:tcPr>
+            <w:tcW w:type="dxa" w:w="3069"/>
+            <w:tcMar>
+              <w:top w:type="dxa" w:w="70"/>
+              <w:left w:type="dxa" w:w="110"/>
+              <w:bottom w:type="dxa" w:w="70"/>
+              <w:right w:type="dxa" w:w="110"/>
+            </w:tcMar>
+          </w:tcPr>
+          <w:p>
+            <w:pPr>
+              <w:spacing w:after="0" w:line="260"/>
+            </w:pPr>
+            <w:r>
+              <w:rPr>
+                <w:rFonts w:ascii="Cambria" w:cs="Cambria" w:eastAsia="Cambria" w:hAnsi="Cambria"/>
+                <w:b/>
+                <w:bCs/>
+                <w:sz w:val="20"/>
+                <w:szCs w:val="20"/>
+              </w:rPr>
+              <w:t xml:space="preserve">Archivo</w:t>
+            </w:r>
+          </w:p>
+        </w:tc>
+        <w:tc>
+          <w:tcPr>
+            <w:tcW w:type="dxa" w:w="3249"/>
+            <w:tcMar>
+              <w:top w:type="dxa" w:w="70"/>
+              <w:left w:type="dxa" w:w="110"/>
+              <w:bottom w:type="dxa" w:w="70"/>
+              <w:right w:type="dxa" w:w="110"/>
+            </w:tcMar>
+          </w:tcPr>
+          <w:p>
+            <w:pPr>
+              <w:spacing w:after="0" w:line="260"/>
+            </w:pPr>
+            <w:r>
+              <w:rPr>
+                <w:rFonts w:ascii="Cambria" w:cs="Cambria" w:eastAsia="Cambria" w:hAnsi="Cambria"/>
+                <w:b/>
+                <w:bCs/>
+                <w:sz w:val="20"/>
+                <w:szCs w:val="20"/>
+              </w:rPr>
+              <w:t xml:space="preserve">Resultado de tres corridas</w:t>
+            </w:r>
+          </w:p>
+        </w:tc>
+      </w:tr>
+      <w:tr>
+        <w:tc>
+          <w:tcPr>
+            <w:tcW w:type="dxa" w:w="2708"/>
+            <w:tcMar>
+              <w:top w:type="dxa" w:w="70"/>
+              <w:left w:type="dxa" w:w="110"/>
+              <w:bottom w:type="dxa" w:w="70"/>
+              <w:right w:type="dxa" w:w="110"/>
+            </w:tcMar>
+          </w:tcPr>
+          <w:p>
+            <w:pPr>
+              <w:spacing w:after="0" w:line="260"/>
+            </w:pPr>
+            <w:r>
+              <w:rPr>
+                <w:rFonts w:ascii="Cambria" w:cs="Cambria" w:eastAsia="Cambria" w:hAnsi="Cambria"/>
+                <w:b w:val="false"/>
+                <w:bCs w:val="false"/>
+                <w:sz w:val="20"/>
+                <w:szCs w:val="20"/>
+              </w:rPr>
+              <w:t xml:space="preserve">una chica</w:t>
+            </w:r>
+          </w:p>
+        </w:tc>
+        <w:tc>
+          <w:tcPr>
+            <w:tcW w:type="dxa" w:w="3069"/>
+            <w:tcMar>
+              <w:top w:type="dxa" w:w="70"/>
+              <w:left w:type="dxa" w:w="110"/>
+              <w:bottom w:type="dxa" w:w="70"/>
+              <w:right w:type="dxa" w:w="110"/>
+            </w:tcMar>
+          </w:tcPr>
+          <w:p>
+            <w:pPr>
+              <w:spacing w:after="0" w:line="260"/>
+            </w:pPr>
+            <w:r>
+              <w:rPr>
+                <w:rFonts w:ascii="Cambria" w:cs="Cambria" w:eastAsia="Cambria" w:hAnsi="Cambria"/>
+                <w:b w:val="false"/>
+                <w:bCs w:val="false"/>
+                <w:sz w:val="20"/>
+                <w:szCs w:val="20"/>
+              </w:rPr>
+              <w:t xml:space="preserve">small.json</w:t>
+            </w:r>
+          </w:p>
+        </w:tc>
+        <w:tc>
+          <w:tcPr>
+            <w:tcW w:type="dxa" w:w="3249"/>
+            <w:tcMar>
+              <w:top w:type="dxa" w:w="70"/>
+              <w:left w:type="dxa" w:w="110"/>
+              <w:bottom w:type="dxa" w:w="70"/>
+              <w:right w:type="dxa" w:w="110"/>
+            </w:tcMar>
+          </w:tcPr>
+          <w:p>
+            <w:pPr>
+              <w:spacing w:after="0" w:line="260"/>
+            </w:pPr>
+            <w:r>
+              <w:rPr>
+                <w:rFonts w:ascii="Cambria" w:cs="Cambria" w:eastAsia="Cambria" w:hAnsi="Cambria"/>
+                <w:b w:val="false"/>
+                <w:bCs w:val="false"/>
+                <w:sz w:val="20"/>
+                <w:szCs w:val="20"/>
+              </w:rPr>
+              <w:t xml:space="preserve">exit 0, validador correcto</w:t>
+            </w:r>
+          </w:p>
+        </w:tc>
+      </w:tr>
+      <w:tr>
+        <w:tc>
+          <w:tcPr>
+            <w:tcW w:type="dxa" w:w="2708"/>
+            <w:tcMar>
+              <w:top w:type="dxa" w:w="70"/>
+              <w:left w:type="dxa" w:w="110"/>
+              <w:bottom w:type="dxa" w:w="70"/>
+              <w:right w:type="dxa" w:w="110"/>
+            </w:tcMar>
+          </w:tcPr>
+          <w:p>
+            <w:pPr>
+              <w:spacing w:after="0" w:line="260"/>
+            </w:pPr>
+            <w:r>
+              <w:rPr>
+                <w:rFonts w:ascii="Cambria" w:cs="Cambria" w:eastAsia="Cambria" w:hAnsi="Cambria"/>
+                <w:b w:val="false"/>
+                <w:bCs w:val="false"/>
+                <w:sz w:val="20"/>
+                <w:szCs w:val="20"/>
+              </w:rPr>
+              <w:t xml:space="preserve">grande: 64 couriers, tasa altisima</w:t>
+            </w:r>
+          </w:p>
+        </w:tc>
+        <w:tc>
+          <w:tcPr>
+            <w:tcW w:type="dxa" w:w="3069"/>
+            <w:tcMar>
+              <w:top w:type="dxa" w:w="70"/>
+              <w:left w:type="dxa" w:w="110"/>
+              <w:bottom w:type="dxa" w:w="70"/>
+              <w:right w:type="dxa" w:w="110"/>
+            </w:tcMar>
+          </w:tcPr>
+          <w:p>
+            <w:pPr>
+              <w:spacing w:after="0" w:line="260"/>
+            </w:pPr>
+            <w:r>
+              <w:rPr>
+                <w:rFonts w:ascii="Cambria" w:cs="Cambria" w:eastAsia="Cambria" w:hAnsi="Cambria"/>
+                <w:b w:val="false"/>
+                <w:bCs w:val="false"/>
+                <w:sz w:val="20"/>
+                <w:szCs w:val="20"/>
+              </w:rPr>
+              <w:t xml:space="preserve">exp6_pool_64_couriers.json</w:t>
+            </w:r>
+          </w:p>
+        </w:tc>
+        <w:tc>
+          <w:tcPr>
+            <w:tcW w:type="dxa" w:w="3249"/>
+            <w:tcMar>
+              <w:top w:type="dxa" w:w="70"/>
+              <w:left w:type="dxa" w:w="110"/>
+              <w:bottom w:type="dxa" w:w="70"/>
+              <w:right w:type="dxa" w:w="110"/>
+            </w:tcMar>
+          </w:tcPr>
+          <w:p>
+            <w:pPr>
+              <w:spacing w:after="0" w:line="260"/>
+            </w:pPr>
+            <w:r>
+              <w:rPr>
+                <w:rFonts w:ascii="Cambria" w:cs="Cambria" w:eastAsia="Cambria" w:hAnsi="Cambria"/>
+                <w:b w:val="false"/>
+                <w:bCs w:val="false"/>
+                <w:sz w:val="20"/>
+                <w:szCs w:val="20"/>
+              </w:rPr>
+              <w:t xml:space="preserve">exit 0, validador correcto</w:t>
+            </w:r>
+          </w:p>
+        </w:tc>
+      </w:tr>
+      <w:tr>
+        <w:tc>
+          <w:tcPr>
+            <w:tcW w:type="dxa" w:w="2708"/>
+            <w:tcMar>
+              <w:top w:type="dxa" w:w="70"/>
+              <w:left w:type="dxa" w:w="110"/>
+              <w:bottom w:type="dxa" w:w="70"/>
+              <w:right w:type="dxa" w:w="110"/>
+            </w:tcMar>
+          </w:tcPr>
+          <w:p>
+            <w:pPr>
+              <w:spacing w:after="0" w:line="260"/>
+            </w:pPr>
+            <w:r>
+              <w:rPr>
+                <w:rFonts w:ascii="Cambria" w:cs="Cambria" w:eastAsia="Cambria" w:hAnsi="Cambria"/>
+                <w:b w:val="false"/>
+                <w:bCs w:val="false"/>
+                <w:sz w:val="20"/>
+                <w:szCs w:val="20"/>
+              </w:rPr>
+              <w:t xml:space="preserve">rafagas en el mismo instante</w:t>
+            </w:r>
+          </w:p>
+        </w:tc>
+        <w:tc>
+          <w:tcPr>
+            <w:tcW w:type="dxa" w:w="3069"/>
+            <w:tcMar>
+              <w:top w:type="dxa" w:w="70"/>
+              <w:left w:type="dxa" w:w="110"/>
+              <w:bottom w:type="dxa" w:w="70"/>
+              <w:right w:type="dxa" w:w="110"/>
+            </w:tcMar>
+          </w:tcPr>
+          <w:p>
+            <w:pPr>
+              <w:spacing w:after="0" w:line="260"/>
+            </w:pPr>
+            <w:r>
+              <w:rPr>
+                <w:rFonts w:ascii="Cambria" w:cs="Cambria" w:eastAsia="Cambria" w:hAnsi="Cambria"/>
+                <w:b w:val="false"/>
+                <w:bCs w:val="false"/>
+                <w:sz w:val="20"/>
+                <w:szCs w:val="20"/>
+              </w:rPr>
+              <w:t xml:space="preserve">bursts_same_instant.json</w:t>
+            </w:r>
+          </w:p>
+        </w:tc>
+        <w:tc>
+          <w:tcPr>
+            <w:tcW w:type="dxa" w:w="3249"/>
+            <w:tcMar>
+              <w:top w:type="dxa" w:w="70"/>
+              <w:left w:type="dxa" w:w="110"/>
+              <w:bottom w:type="dxa" w:w="70"/>
+              <w:right w:type="dxa" w:w="110"/>
+            </w:tcMar>
+          </w:tcPr>
+          <w:p>
+            <w:pPr>
+              <w:spacing w:after="0" w:line="260"/>
+            </w:pPr>
+            <w:r>
+              <w:rPr>
+                <w:rFonts w:ascii="Cambria" w:cs="Cambria" w:eastAsia="Cambria" w:hAnsi="Cambria"/>
+                <w:b w:val="false"/>
+                <w:bCs w:val="false"/>
+                <w:sz w:val="20"/>
+                <w:szCs w:val="20"/>
+              </w:rPr>
+              <w:t xml:space="preserve">exit 0, validador correcto</w:t>
+            </w:r>
+          </w:p>
+        </w:tc>
+      </w:tr>
+      <w:tr>
+        <w:tc>
+          <w:tcPr>
+            <w:tcW w:type="dxa" w:w="2708"/>
+            <w:tcMar>
+              <w:top w:type="dxa" w:w="70"/>
+              <w:left w:type="dxa" w:w="110"/>
+              <w:bottom w:type="dxa" w:w="70"/>
+              <w:right w:type="dxa" w:w="110"/>
+            </w:tcMar>
+          </w:tcPr>
+          <w:p>
+            <w:pPr>
+              <w:spacing w:after="0" w:line="260"/>
+            </w:pPr>
+            <w:r>
+              <w:rPr>
+                <w:rFonts w:ascii="Cambria" w:cs="Cambria" w:eastAsia="Cambria" w:hAnsi="Cambria"/>
+                <w:b w:val="false"/>
+                <w:bCs w:val="false"/>
+                <w:sz w:val="20"/>
+                <w:szCs w:val="20"/>
+              </w:rPr>
+              <w:t xml:space="preserve">un solo lugar de retiro</w:t>
+            </w:r>
+          </w:p>
+        </w:tc>
+        <w:tc>
+          <w:tcPr>
+            <w:tcW w:type="dxa" w:w="3069"/>
+            <w:tcMar>
+              <w:top w:type="dxa" w:w="70"/>
+              <w:left w:type="dxa" w:w="110"/>
+              <w:bottom w:type="dxa" w:w="70"/>
+              <w:right w:type="dxa" w:w="110"/>
+            </w:tcMar>
+          </w:tcPr>
+          <w:p>
+            <w:pPr>
+              <w:spacing w:after="0" w:line="260"/>
+            </w:pPr>
+            <w:r>
+              <w:rPr>
+                <w:rFonts w:ascii="Cambria" w:cs="Cambria" w:eastAsia="Cambria" w:hAnsi="Cambria"/>
+                <w:b w:val="false"/>
+                <w:bCs w:val="false"/>
+                <w:sz w:val="20"/>
+                <w:szCs w:val="20"/>
+              </w:rPr>
+              <w:t xml:space="preserve">exp4_un_solo_slot.json</w:t>
+            </w:r>
+          </w:p>
+        </w:tc>
+        <w:tc>
+          <w:tcPr>
+            <w:tcW w:type="dxa" w:w="3249"/>
+            <w:tcMar>
+              <w:top w:type="dxa" w:w="70"/>
+              <w:left w:type="dxa" w:w="110"/>
+              <w:bottom w:type="dxa" w:w="70"/>
+              <w:right w:type="dxa" w:w="110"/>
+            </w:tcMar>
+          </w:tcPr>
+          <w:p>
+            <w:pPr>
+              <w:spacing w:after="0" w:line="260"/>
+            </w:pPr>
+            <w:r>
+              <w:rPr>
+                <w:rFonts w:ascii="Cambria" w:cs="Cambria" w:eastAsia="Cambria" w:hAnsi="Cambria"/>
+                <w:b w:val="false"/>
+                <w:bCs w:val="false"/>
+                <w:sz w:val="20"/>
+                <w:szCs w:val="20"/>
+              </w:rPr>
+              <w:t xml:space="preserve">exit 0, validador correcto</w:t>
+            </w:r>
+          </w:p>
+        </w:tc>
+      </w:tr>
+      <w:tr>
+        <w:tc>
+          <w:tcPr>
+            <w:tcW w:type="dxa" w:w="2708"/>
+            <w:tcMar>
+              <w:top w:type="dxa" w:w="70"/>
+              <w:left w:type="dxa" w:w="110"/>
+              <w:bottom w:type="dxa" w:w="70"/>
+              <w:right w:type="dxa" w:w="110"/>
+            </w:tcMar>
+          </w:tcPr>
+          <w:p>
+            <w:pPr>
+              <w:spacing w:after="0" w:line="260"/>
+            </w:pPr>
+            <w:r>
+              <w:rPr>
+                <w:rFonts w:ascii="Cambria" w:cs="Cambria" w:eastAsia="Cambria" w:hAnsi="Cambria"/>
+                <w:b w:val="false"/>
+                <w:bCs w:val="false"/>
+                <w:sz w:val="20"/>
+                <w:szCs w:val="20"/>
+              </w:rPr>
+              <w:t xml:space="preserve">bolsa de capacidad 1</w:t>
+            </w:r>
+          </w:p>
+        </w:tc>
+        <w:tc>
+          <w:tcPr>
+            <w:tcW w:type="dxa" w:w="3069"/>
+            <w:tcMar>
+              <w:top w:type="dxa" w:w="70"/>
+              <w:left w:type="dxa" w:w="110"/>
+              <w:bottom w:type="dxa" w:w="70"/>
+              <w:right w:type="dxa" w:w="110"/>
+            </w:tcMar>
+          </w:tcPr>
+          <w:p>
+            <w:pPr>
+              <w:spacing w:after="0" w:line="260"/>
+            </w:pPr>
+            <w:r>
+              <w:rPr>
+                <w:rFonts w:ascii="Cambria" w:cs="Cambria" w:eastAsia="Cambria" w:hAnsi="Cambria"/>
+                <w:b w:val="false"/>
+                <w:bCs w:val="false"/>
+                <w:sz w:val="20"/>
+                <w:szCs w:val="20"/>
+              </w:rPr>
+              <w:t xml:space="preserve">bag_capacity_1.json</w:t>
+            </w:r>
+          </w:p>
+        </w:tc>
+        <w:tc>
+          <w:tcPr>
+            <w:tcW w:type="dxa" w:w="3249"/>
+            <w:tcMar>
+              <w:top w:type="dxa" w:w="70"/>
+              <w:left w:type="dxa" w:w="110"/>
+              <w:bottom w:type="dxa" w:w="70"/>
+              <w:right w:type="dxa" w:w="110"/>
+            </w:tcMar>
+          </w:tcPr>
+          <w:p>
+            <w:pPr>
+              <w:spacing w:after="0" w:line="260"/>
+            </w:pPr>
+            <w:r>
+              <w:rPr>
+                <w:rFonts w:ascii="Cambria" w:cs="Cambria" w:eastAsia="Cambria" w:hAnsi="Cambria"/>
+                <w:b w:val="false"/>
+                <w:bCs w:val="false"/>
+                <w:sz w:val="20"/>
+                <w:szCs w:val="20"/>
+              </w:rPr>
+              <w:t xml:space="preserve">exit 0, validador correcto</w:t>
+            </w:r>
+          </w:p>
+        </w:tc>
+      </w:tr>
+      <w:tr>
+        <w:tc>
+          <w:tcPr>
+            <w:tcW w:type="dxa" w:w="2708"/>
+            <w:tcMar>
+              <w:top w:type="dxa" w:w="70"/>
+              <w:left w:type="dxa" w:w="110"/>
+              <w:bottom w:type="dxa" w:w="70"/>
+              <w:right w:type="dxa" w:w="110"/>
+            </w:tcMar>
+          </w:tcPr>
+          <w:p>
+            <w:pPr>
+              <w:spacing w:after="0" w:line="260"/>
+            </w:pPr>
+            <w:r>
+              <w:rPr>
+                <w:rFonts w:ascii="Cambria" w:cs="Cambria" w:eastAsia="Cambria" w:hAnsi="Cambria"/>
+                <w:b w:val="false"/>
+                <w:bCs w:val="false"/>
+                <w:sz w:val="20"/>
+                <w:szCs w:val="20"/>
+              </w:rPr>
+              <w:t xml:space="preserve">probabilidad de averia 1</w:t>
+            </w:r>
+          </w:p>
+        </w:tc>
+        <w:tc>
+          <w:tcPr>
+            <w:tcW w:type="dxa" w:w="3069"/>
+            <w:tcMar>
+              <w:top w:type="dxa" w:w="70"/>
+              <w:left w:type="dxa" w:w="110"/>
+              <w:bottom w:type="dxa" w:w="70"/>
+              <w:right w:type="dxa" w:w="110"/>
+            </w:tcMar>
+          </w:tcPr>
+          <w:p>
+            <w:pPr>
+              <w:spacing w:after="0" w:line="260"/>
+            </w:pPr>
+            <w:r>
+              <w:rPr>
+                <w:rFonts w:ascii="Cambria" w:cs="Cambria" w:eastAsia="Cambria" w:hAnsi="Cambria"/>
+                <w:b w:val="false"/>
+                <w:bCs w:val="false"/>
+                <w:sz w:val="20"/>
+                <w:szCs w:val="20"/>
+              </w:rPr>
+              <w:t xml:space="preserve">breakdown_always.json</w:t>
+            </w:r>
+          </w:p>
+        </w:tc>
+        <w:tc>
+          <w:tcPr>
+            <w:tcW w:type="dxa" w:w="3249"/>
+            <w:tcMar>
+              <w:top w:type="dxa" w:w="70"/>
+              <w:left w:type="dxa" w:w="110"/>
+              <w:bottom w:type="dxa" w:w="70"/>
+              <w:right w:type="dxa" w:w="110"/>
+            </w:tcMar>
+          </w:tcPr>
+          <w:p>
+            <w:pPr>
+              <w:spacing w:after="0" w:line="260"/>
+            </w:pPr>
+            <w:r>
+              <w:rPr>
+                <w:rFonts w:ascii="Cambria" w:cs="Cambria" w:eastAsia="Cambria" w:hAnsi="Cambria"/>
+                <w:b w:val="false"/>
+                <w:bCs w:val="false"/>
+                <w:sz w:val="20"/>
+                <w:szCs w:val="20"/>
+              </w:rPr>
+              <w:t xml:space="preserve">exit 0, validador correcto</w:t>
+            </w:r>
+          </w:p>
+        </w:tc>
+      </w:tr>
+      <w:tr>
+        <w:tc>
+          <w:tcPr>
+            <w:tcW w:type="dxa" w:w="2708"/>
+            <w:tcMar>
+              <w:top w:type="dxa" w:w="70"/>
+              <w:left w:type="dxa" w:w="110"/>
+              <w:bottom w:type="dxa" w:w="70"/>
+              <w:right w:type="dxa" w:w="110"/>
+            </w:tcMar>
+          </w:tcPr>
+          <w:p>
+            <w:pPr>
+              <w:spacing w:after="0" w:line="260"/>
+            </w:pPr>
+            <w:r>
+              <w:rPr>
+                <w:rFonts w:ascii="Cambria" w:cs="Cambria" w:eastAsia="Cambria" w:hAnsi="Cambria"/>
+                <w:b w:val="false"/>
+                <w:bCs w:val="false"/>
+                <w:sz w:val="20"/>
+                <w:szCs w:val="20"/>
+              </w:rPr>
+              <w:t xml:space="preserve">destinos inalcanzables</w:t>
+            </w:r>
+          </w:p>
+        </w:tc>
+        <w:tc>
+          <w:tcPr>
+            <w:tcW w:type="dxa" w:w="3069"/>
+            <w:tcMar>
+              <w:top w:type="dxa" w:w="70"/>
+              <w:left w:type="dxa" w:w="110"/>
+              <w:bottom w:type="dxa" w:w="70"/>
+              <w:right w:type="dxa" w:w="110"/>
+            </w:tcMar>
+          </w:tcPr>
+          <w:p>
+            <w:pPr>
+              <w:spacing w:after="0" w:line="260"/>
+            </w:pPr>
+            <w:r>
+              <w:rPr>
+                <w:rFonts w:ascii="Cambria" w:cs="Cambria" w:eastAsia="Cambria" w:hAnsi="Cambria"/>
+                <w:b w:val="false"/>
+                <w:bCs w:val="false"/>
+                <w:sz w:val="20"/>
+                <w:szCs w:val="20"/>
+              </w:rPr>
+              <w:t xml:space="preserve">unreachable.json</w:t>
+            </w:r>
+          </w:p>
+        </w:tc>
+        <w:tc>
+          <w:tcPr>
+            <w:tcW w:type="dxa" w:w="3249"/>
+            <w:tcMar>
+              <w:top w:type="dxa" w:w="70"/>
+              <w:left w:type="dxa" w:w="110"/>
+              <w:bottom w:type="dxa" w:w="70"/>
+              <w:right w:type="dxa" w:w="110"/>
+            </w:tcMar>
+          </w:tcPr>
+          <w:p>
+            <w:pPr>
+              <w:spacing w:after="0" w:line="260"/>
+            </w:pPr>
+            <w:r>
+              <w:rPr>
+                <w:rFonts w:ascii="Cambria" w:cs="Cambria" w:eastAsia="Cambria" w:hAnsi="Cambria"/>
+                <w:b w:val="false"/>
+                <w:bCs w:val="false"/>
+                <w:sz w:val="20"/>
+                <w:szCs w:val="20"/>
+              </w:rPr>
+              <w:t xml:space="preserve">exit 0, validador correcto</w:t>
+            </w:r>
+          </w:p>
+        </w:tc>
+      </w:tr>
+      <w:tr>
+        <w:tc>
+          <w:tcPr>
+            <w:tcW w:type="dxa" w:w="2708"/>
+            <w:tcMar>
+              <w:top w:type="dxa" w:w="70"/>
+              <w:left w:type="dxa" w:w="110"/>
+              <w:bottom w:type="dxa" w:w="70"/>
+              <w:right w:type="dxa" w:w="110"/>
+            </w:tcMar>
+          </w:tcPr>
+          <w:p>
+            <w:pPr>
+              <w:spacing w:after="0" w:line="260"/>
+            </w:pPr>
+            <w:r>
+              <w:rPr>
+                <w:rFonts w:ascii="Cambria" w:cs="Cambria" w:eastAsia="Cambria" w:hAnsi="Cambria"/>
+                <w:b w:val="false"/>
+                <w:bCs w:val="false"/>
+                <w:sz w:val="20"/>
+                <w:szCs w:val="20"/>
+              </w:rPr>
+              <w:t xml:space="preserve">varias invalidas</w:t>
+            </w:r>
+          </w:p>
+        </w:tc>
+        <w:tc>
+          <w:tcPr>
+            <w:tcW w:type="dxa" w:w="3069"/>
+            <w:tcMar>
+              <w:top w:type="dxa" w:w="70"/>
+              <w:left w:type="dxa" w:w="110"/>
+              <w:bottom w:type="dxa" w:w="70"/>
+              <w:right w:type="dxa" w:w="110"/>
+            </w:tcMar>
+          </w:tcPr>
+          <w:p>
+            <w:pPr>
+              <w:spacing w:after="0" w:line="260"/>
+            </w:pPr>
+            <w:r>
+              <w:rPr>
+                <w:rFonts w:ascii="Cambria" w:cs="Cambria" w:eastAsia="Cambria" w:hAnsi="Cambria"/>
+                <w:b w:val="false"/>
+                <w:bCs w:val="false"/>
+                <w:sz w:val="20"/>
+                <w:szCs w:val="20"/>
+              </w:rPr>
+              <w:t xml:space="preserve">invalid_*.json (doce)</w:t>
+            </w:r>
+          </w:p>
+        </w:tc>
+        <w:tc>
+          <w:tcPr>
+            <w:tcW w:type="dxa" w:w="3249"/>
+            <w:tcMar>
+              <w:top w:type="dxa" w:w="70"/>
+              <w:left w:type="dxa" w:w="110"/>
+              <w:bottom w:type="dxa" w:w="70"/>
+              <w:right w:type="dxa" w:w="110"/>
+            </w:tcMar>
+          </w:tcPr>
+          <w:p>
+            <w:pPr>
+              <w:spacing w:after="0" w:line="260"/>
+            </w:pPr>
+            <w:r>
+              <w:rPr>
+                <w:rFonts w:ascii="Cambria" w:cs="Cambria" w:eastAsia="Cambria" w:hAnsi="Cambria"/>
+                <w:b w:val="false"/>
+                <w:bCs w:val="false"/>
+                <w:sz w:val="20"/>
+                <w:szCs w:val="20"/>
+              </w:rPr>
+              <w:t xml:space="preserve">todas salen con codigo distinto de cero</w:t>
+            </w:r>
+          </w:p>
+        </w:tc>
+      </w:tr>
+    </w:tbl>
+    <w:p>
+      <w:pPr>
+        <w:spacing w:after="200" w:before="80" w:line="260"/>
+      </w:pPr>
+      <w:r>
+        <w:rPr>
+          <w:rFonts w:ascii="Cambria" w:cs="Cambria" w:eastAsia="Cambria" w:hAnsi="Cambria"/>
+          <w:i/>
+          <w:iCs/>
+          <w:sz w:val="19"/>
+          <w:szCs w:val="19"/>
+        </w:rPr>
+        <w:t xml:space="preserve">Tabla 11. Quince corridas de los escenarios propios, cero fallas.</w:t>
+      </w:r>
+    </w:p>
+    <w:p>
+      <w:pPr>
+        <w:spacing w:after="140" w:line="300"/>
+      </w:pPr>
+      <w:r>
+        <w:rPr>
+          <w:rFonts w:ascii="Cambria" w:cs="Cambria" w:eastAsia="Cambria" w:hAnsi="Cambria"/>
+          <w:sz w:val="22"/>
+          <w:szCs w:val="22"/>
+        </w:rPr>
+        <w:t xml:space="preserve">Lo que cada uno provoca de verdad: bursts_same_instant crea 4042 ordenes con intervalo de 50 ms y rafagas de hasta 60, y las rechaza todas por cola llena con el contador de pendientes clavado en el maximo configurado; breakdown_always agota la flota y el programa sigue respondiendo y cierra con cero; bag_capacity_1 fuerza que el traspaso solo pueda concretarse hacia un courier vacio, que es el caso mas restrictivo del todo o nada.</w:t>
+      </w:r>
+    </w:p>
+    <w:p>
+      <w:pPr>
+        <w:spacing w:after="140" w:line="300"/>
+      </w:pPr>
+      <w:r>
+        <w:rPr>
+          <w:rFonts w:ascii="Cambria" w:cs="Cambria" w:eastAsia="Cambria" w:hAnsi="Cambria"/>
+          <w:b/>
+          <w:bCs/>
+          <w:sz w:val="22"/>
+          <w:szCs w:val="22"/>
+        </w:rPr>
+        <w:t xml:space="preserve">El escenario de destinos inalcanzables encontro un defecto.</w:t>
+      </w:r>
+      <w:r>
+        <w:rPr>
+          <w:rFonts w:ascii="Cambria" w:cs="Cambria" w:eastAsia="Cambria" w:hAnsi="Cambria"/>
+          <w:sz w:val="22"/>
+          <w:szCs w:val="22"/>
+        </w:rPr>
+        <w:t xml:space="preserve"> No usa el mapa real: tiene un grafo de seis nodos hecho a mano, donde un nodo no tiene ninguna calle y otro no tiene calles de entrada. Hace falta asi porque el grafo oficial es fuertemente conexo -desde cada uno de sus seis restaurantes se llega a los 668 nodos-, de modo que con la configuracion de entrega el rechazo por destino inalcanzable no puede ocurrir nunca y ese camino quedaba sin ejercitar en toda la bateria de pruebas.</w:t>
+      </w:r>
+    </w:p>
+    <w:p>
+      <w:pPr>
         <w:pStyle w:val="Heading1"/>
         <w:spacing w:after="180" w:before="360"/>
       </w:pPr>
@@ -8787,7 +9609,7 @@
           <w:sz w:val="22"/>
           <w:szCs w:val="22"/>
         </w:rPr>
-        <w:t xml:space="preserve">Los cuatro defectos siguientes los encontro el validador, no las pruebas unitarias ni los sanitizers. Ninguno era una carrera de datos: en todos los casos los accesos estaban correctamente sincronizados y lo invalido era la secuencia de estados.</w:t>
+        <w:t xml:space="preserve">Ninguno de los defectos siguientes era una carrera de datos: en todos los casos los accesos estaban correctamente sincronizados. Cuatro los encontro el validador del registro, no las pruebas unitarias ni los sanitizers, porque lo invalido era la secuencia de estados. El quinto no lo pudo encontrar ni el validador, y vale la pena ver por que: el log era internamente consistente, los contadores cuadraban, y lo unico mal era la razon de un rechazo. Un validador compara el log contra las reglas del log; eso solo se ve comparando el log contra el mundo, construyendo el escenario que lo provoca.</w:t>
       </w:r>
     </w:p>
     <w:tbl>
@@ -9153,6 +9975,86 @@
                 <w:sz w:val="20"/>
                 <w:szCs w:val="20"/>
               </w:rPr>
+              <w:t xml:space="preserve">Los destinos inalcanzables se rechazaban con la razon equivocada</w:t>
+            </w:r>
+          </w:p>
+        </w:tc>
+        <w:tc>
+          <w:tcPr>
+            <w:tcW w:type="dxa" w:w="4332"/>
+            <w:tcMar>
+              <w:top w:type="dxa" w:w="70"/>
+              <w:left w:type="dxa" w:w="110"/>
+              <w:bottom w:type="dxa" w:w="70"/>
+              <w:right w:type="dxa" w:w="110"/>
+            </w:tcMar>
+          </w:tcPr>
+          <w:p>
+            <w:pPr>
+              <w:spacing w:after="0" w:line="260"/>
+            </w:pPr>
+            <w:r>
+              <w:rPr>
+                <w:rFonts w:ascii="Cambria" w:cs="Cambria" w:eastAsia="Cambria" w:hAnsi="Cambria"/>
+                <w:b w:val="false"/>
+                <w:bCs w:val="false"/>
+                <w:sz w:val="20"/>
+                <w:szCs w:val="20"/>
+              </w:rPr>
+              <w:t xml:space="preserve">El enunciado dice que una orden cuyo destino no se puede alcanzar por la red de calles se rechaza con razon unreachable. Se rechazaba con noCourier: la razon unreachable solo se emitia cuando un courier no podia llegar al restaurante, asi que un destino inalcanzable hacia que todas las estimaciones volvieran sin camino, el dispatcher reintentaba, y la orden vencia su plazo de aceptacion. El validador no lo vio porque assigned a rejected es una transicion legal y los contadores cuadraban: el log era internamente consistente y lo que estaba mal era la razon.</w:t>
+            </w:r>
+          </w:p>
+        </w:tc>
+        <w:tc>
+          <w:tcPr>
+            <w:tcW w:type="dxa" w:w="2708"/>
+            <w:tcMar>
+              <w:top w:type="dxa" w:w="70"/>
+              <w:left w:type="dxa" w:w="110"/>
+              <w:bottom w:type="dxa" w:w="70"/>
+              <w:right w:type="dxa" w:w="110"/>
+            </w:tcMar>
+          </w:tcPr>
+          <w:p>
+            <w:pPr>
+              <w:spacing w:after="0" w:line="260"/>
+            </w:pPr>
+            <w:r>
+              <w:rPr>
+                <w:rFonts w:ascii="Cambria" w:cs="Cambria" w:eastAsia="Cambria" w:hAnsi="Cambria"/>
+                <w:b w:val="false"/>
+                <w:bCs w:val="false"/>
+                <w:sz w:val="20"/>
+                <w:szCs w:val="20"/>
+              </w:rPr>
+              <w:t xml:space="preserve">Una consulta de alcanzabilidad del restaurante al destino, una sola vez por orden y antes de cotizar. La pregunta correcta es sobre el grafo y no sobre los couriers: entre dos nodos hay camino o no hay, y eso no cambia con el tiempo. De cero rechazos unreachable a 125 en el mismo escenario.</w:t>
+            </w:r>
+          </w:p>
+        </w:tc>
+      </w:tr>
+      <w:tr>
+        <w:tc>
+          <w:tcPr>
+            <w:tcW w:type="dxa" w:w="1986"/>
+            <w:tcMar>
+              <w:top w:type="dxa" w:w="70"/>
+              <w:left w:type="dxa" w:w="110"/>
+              <w:bottom w:type="dxa" w:w="70"/>
+              <w:right w:type="dxa" w:w="110"/>
+            </w:tcMar>
+          </w:tcPr>
+          <w:p>
+            <w:pPr>
+              <w:spacing w:after="0" w:line="260"/>
+            </w:pPr>
+            <w:r>
+              <w:rPr>
+                <w:rFonts w:ascii="Cambria" w:cs="Cambria" w:eastAsia="Cambria" w:hAnsi="Cambria"/>
+                <w:b w:val="false"/>
+                <w:bCs w:val="false"/>
+                <w:sz w:val="20"/>
+                <w:szCs w:val="20"/>
+              </w:rPr>
               <w:t xml:space="preserve">Un experimento que mejoraba una metrica rompia dos reglas</w:t>
             </w:r>
           </w:p>
@@ -9223,7 +10125,7 @@
           <w:sz w:val="19"/>
           <w:szCs w:val="19"/>
         </w:rPr>
-        <w:t xml:space="preserve">Tabla 10. Los cuatro defectos y su correccion.</w:t>
+        <w:t xml:space="preserve">Tabla 10. Los cinco defectos y su correccion.</w:t>
       </w:r>
     </w:p>
     <w:p>
@@ -9470,6 +10372,19 @@
           <w:sz w:val="22"/>
           <w:szCs w:val="22"/>
         </w:rPr>
+        <w:t xml:space="preserve">Hay una tercera, que aparecio al final. Un validador independiente es muy fuerte contra los logs mal formados, pero no puede ver un dato internamente consistente y aun asi equivocado. El rechazo con la razon incorrecta no lo detecto ninguna de las tres herramientas: lo encontro construir a mano el escenario que el enunciado anuncia, con un grafo donde el caso es frecuente en vez de imposible. Las herramientas verifican consistencia; que el programa diga la verdad sobre el mundo hay que probarlo contra el mundo.</w:t>
+      </w:r>
+    </w:p>
+    <w:p>
+      <w:pPr>
+        <w:spacing w:after="140" w:line="300"/>
+      </w:pPr>
+      <w:r>
+        <w:rPr>
+          <w:rFonts w:ascii="Cambria" w:cs="Cambria" w:eastAsia="Cambria" w:hAnsi="Cambria"/>
+          <w:sz w:val="22"/>
+          <w:szCs w:val="22"/>
+        </w:rPr>
         <w:t xml:space="preserve">La otra leccion es sobre el valor de las predicciones refutadas. Dos de las hipotesis del diseno resultaron falsas al medirlas, y en los dos casos la razon por la que eran falsas describe el sistema mejor que la hipotesis original: las estimaciones son demasiado cortas para que los hilos se acumulen, y el cuello de botella de este mapa es el viaje y no la cocina.</w:t>
       </w:r>
     </w:p>
@@ -9660,7 +10575,7 @@
     </w:p>
     <w:p>
       <w:pPr>
-        <w:spacing w:after="180" w:line="240"/>
+        <w:spacing w:after="0" w:line="240"/>
         <w:ind w:left="360"/>
       </w:pPr>
       <w:r>
@@ -9670,6 +10585,62 @@
           <w:szCs w:val="18"/>
         </w:rPr>
         <w:t xml:space="preserve">python3 tools/validate_log.py events.log resumen.txt</w:t>
+      </w:r>
+    </w:p>
+    <w:p>
+      <w:pPr>
+        <w:spacing w:after="0" w:line="240"/>
+        <w:ind w:left="360"/>
+      </w:pPr>
+      <w:r>
+        <w:rPr>
+          <w:rFonts w:ascii="Consolas" w:cs="Consolas" w:eastAsia="Consolas" w:hAnsi="Consolas"/>
+          <w:sz w:val="18"/>
+          <w:szCs w:val="18"/>
+        </w:rPr>
+        <w:t xml:space="preserve"> </w:t>
+      </w:r>
+    </w:p>
+    <w:p>
+      <w:pPr>
+        <w:spacing w:after="0" w:line="240"/>
+        <w:ind w:left="360"/>
+      </w:pPr>
+      <w:r>
+        <w:rPr>
+          <w:rFonts w:ascii="Consolas" w:cs="Consolas" w:eastAsia="Consolas" w:hAnsi="Consolas"/>
+          <w:sz w:val="18"/>
+          <w:szCs w:val="18"/>
+        </w:rPr>
+        <w:t xml:space="preserve"># los escenarios del enunciado, y las doce configuraciones invalidas</w:t>
+      </w:r>
+    </w:p>
+    <w:p>
+      <w:pPr>
+        <w:spacing w:after="0" w:line="240"/>
+        <w:ind w:left="360"/>
+      </w:pPr>
+      <w:r>
+        <w:rPr>
+          <w:rFonts w:ascii="Consolas" w:cs="Consolas" w:eastAsia="Consolas" w:hAnsi="Consolas"/>
+          <w:sz w:val="18"/>
+          <w:szCs w:val="18"/>
+        </w:rPr>
+        <w:t xml:space="preserve">./build/delivery_sim config/tests/unreachable.json --log run.log --no-window</w:t>
+      </w:r>
+    </w:p>
+    <w:p>
+      <w:pPr>
+        <w:spacing w:after="180" w:line="240"/>
+        <w:ind w:left="360"/>
+      </w:pPr>
+      <w:r>
+        <w:rPr>
+          <w:rFonts w:ascii="Consolas" w:cs="Consolas" w:eastAsia="Consolas" w:hAnsi="Consolas"/>
+          <w:sz w:val="18"/>
+          <w:szCs w:val="18"/>
+        </w:rPr>
+        <w:t xml:space="preserve">bash tools/check_invalid_configs.sh</w:t>
       </w:r>
     </w:p>
     <w:p>
@@ -9920,6 +10891,75 @@
                 <w:szCs w:val="20"/>
               </w:rPr>
               <w:t xml:space="preserve">Diecisiete programas de prueba y el script que los compila y ejecuta.</w:t>
+            </w:r>
+          </w:p>
+        </w:tc>
+      </w:tr>
+      <w:tr>
+        <w:tc>
+          <w:tcPr>
+            <w:tcW w:type="dxa" w:w="2347"/>
+            <w:tcMar>
+              <w:top w:type="dxa" w:w="70"/>
+              <w:left w:type="dxa" w:w="110"/>
+              <w:bottom w:type="dxa" w:w="70"/>
+              <w:right w:type="dxa" w:w="110"/>
+            </w:tcMar>
+          </w:tcPr>
+          <w:p>
+            <w:pPr>
+              <w:spacing w:after="0" w:line="260"/>
+            </w:pPr>
+            <w:r>
+              <w:rPr>
+                <w:rFonts w:ascii="Cambria" w:cs="Cambria" w:eastAsia="Cambria" w:hAnsi="Cambria"/>
+                <w:b w:val="false"/>
+                <w:bCs w:val="false"/>
+                <w:sz w:val="20"/>
+                <w:szCs w:val="20"/>
+              </w:rPr>
+              <w:t xml:space="preserve">config/tests/</w:t>
+            </w:r>
+          </w:p>
+        </w:tc>
+        <w:tc>
+          <w:tcPr>
+            <w:tcW w:type="dxa" w:w="6679"/>
+            <w:tcMar>
+              <w:top w:type="dxa" w:w="70"/>
+              <w:left w:type="dxa" w:w="110"/>
+              <w:bottom w:type="dxa" w:w="70"/>
+              <w:right w:type="dxa" w:w="110"/>
+            </w:tcMar>
+          </w:tcPr>
+          <w:p>
+            <w:pPr>
+              <w:spacing w:after="0" w:line="260"/>
+            </w:pPr>
+            <w:r>
+              <w:rPr>
+                <w:rFonts w:ascii="Cambria" w:cs="Cambria" w:eastAsia="Cambria" w:hAnsi="Cambria"/>
+                <w:b w:val="false"/>
+                <w:bCs w:val="false"/>
+                <w:sz w:val="20"/>
+                <w:szCs w:val="20"/>
+              </w:rPr>
+              <w:t xml:space="preserve">Los escenarios que el enunciado anuncia, y doce configuraciones</w:t>
+            </w:r>
+          </w:p>
+          <w:p>
+            <w:pPr>
+              <w:spacing w:after="0" w:line="260"/>
+            </w:pPr>
+            <w:r>
+              <w:rPr>
+                <w:rFonts w:ascii="Cambria" w:cs="Cambria" w:eastAsia="Cambria" w:hAnsi="Cambria"/>
+                <w:b w:val="false"/>
+                <w:bCs w:val="false"/>
+                <w:sz w:val="20"/>
+                <w:szCs w:val="20"/>
+              </w:rPr>
+              <w:t xml:space="preserve">invalidas con el script que las corre.</w:t>
             </w:r>
           </w:p>
         </w:tc>

</xml_diff>